<commit_message>
Update MR-APPLY: applicationDeclineReason enum to 7 values
Added Unresponsive and Candidate Withdrew per MR-RECON-DEC-002.
Both field table and Updates to Prior Documents section updated.
</commit_message>
<xml_diff>
--- a/PRDs/MR/MR-APPLY.docx
+++ b/PRDs/MR/MR-APPLY.docx
@@ -351,7 +351,7 @@
                 <w:sz w:val="20"/>
                 <w:szCs w:val="20"/>
               </w:rPr>
-              <w:t xml:space="preserve">04-02-26 22:00</w:t>
+              <w:t xml:space="preserve">04-05-26 22:00</w:t>
             </w:r>
           </w:p>
         </w:tc>
@@ -8262,7 +8262,7 @@
                 <w:sz w:val="18"/>
                 <w:szCs w:val="18"/>
               </w:rPr>
-              <w:t xml:space="preserve">Insufficient Experience, Incomplete Application, Failed Background Check, Conflict of Interest, Other</w:t>
+              <w:t xml:space="preserve">Insufficient Experience, Incomplete Application, Failed Background Check, Conflict of Interest, Unresponsive, Candidate Withdrew, Other</w:t>
             </w:r>
           </w:p>
         </w:tc>
@@ -9266,7 +9266,7 @@
                 <w:sz w:val="18"/>
                 <w:szCs w:val="18"/>
               </w:rPr>
-              <w:t xml:space="preserve">Insufficient Experience, Incomplete Application, Failed Background Check, Conflict of Interest, Other</w:t>
+              <w:t xml:space="preserve">Insufficient Experience, Incomplete Application, Failed Background Check, Conflict of Interest, Unresponsive, Candidate Withdrew, Other</w:t>
             </w:r>
           </w:p>
         </w:tc>

</xml_diff>

<commit_message>
MR-APPLY v1.1: clarify duplicate detection mechanism, CRM unavailable fallback, undetected duplicate outcome, New Mentors list view
</commit_message>
<xml_diff>
--- a/PRDs/MR/MR-APPLY.docx
+++ b/PRDs/MR/MR-APPLY.docx
@@ -233,7 +233,7 @@
                 <w:sz w:val="20"/>
                 <w:szCs w:val="20"/>
               </w:rPr>
-              <w:t xml:space="preserve">1.0</w:t>
+              <w:t xml:space="preserve">1.1</w:t>
             </w:r>
           </w:p>
         </w:tc>
@@ -351,7 +351,7 @@
                 <w:sz w:val="20"/>
                 <w:szCs w:val="20"/>
               </w:rPr>
-              <w:t xml:space="preserve">04-05-26 22:00</w:t>
+              <w:t xml:space="preserve">04-06-26 14:30</w:t>
             </w:r>
           </w:p>
         </w:tc>
@@ -739,7 +739,7 @@
           <w:sz w:val="20"/>
           <w:szCs w:val="20"/>
         </w:rPr>
-        <w:t xml:space="preserve">The system performs duplicate detection by checking for an existing Contact record with a matching email address. Three outcomes are possible:</w:t>
+        <w:t xml:space="preserve">The website form submission triggers a query to the CRM, searching for an existing Contact record where the email address matches the submitted personal email. If the CRM is unreachable, the form sends an email containing the submission data to the Mentor Administrator for manual processing. When the CRM is available, four outcomes are possible:</w:t>
       </w:r>
     </w:p>
     <w:p>
@@ -812,6 +812,30 @@
           <w:szCs w:val="20"/>
         </w:rPr>
         <w:t xml:space="preserve">The submission is rejected. The website form displays an error to the submitter indicating that an account with this email already exists and directing them to contact CBM. The system sends a conflict notification email to the Mentor Administrator. No CRM record is created or updated.</w:t>
+      </w:r>
+    </w:p>
+    <w:p>
+      <w:pPr>
+        <w:spacing w:after="120"/>
+        <w:ind w:left="720"/>
+      </w:pPr>
+      <w:r>
+        <w:rPr>
+          <w:rFonts w:ascii="Arial" w:cs="Arial" w:eastAsia="Arial" w:hAnsi="Arial"/>
+          <w:b/>
+          <w:bCs/>
+          <w:sz w:val="20"/>
+          <w:szCs w:val="20"/>
+        </w:rPr>
+        <w:t xml:space="preserve">(d) Match exists but is not detected: </w:t>
+      </w:r>
+      <w:r>
+        <w:rPr>
+          <w:rFonts w:ascii="Arial" w:cs="Arial" w:eastAsia="Arial" w:hAnsi="Arial"/>
+          <w:sz w:val="20"/>
+          <w:szCs w:val="20"/>
+        </w:rPr>
+        <w:t xml:space="preserve">If the applicant submits with an email address not on their existing Contact record, the system creates a new Contact record per outcome (a). When the Mentor Administrator identifies the duplicate during review, they use the contact merge function to consolidate the records.</w:t>
       </w:r>
     </w:p>
     <w:p>
@@ -883,7 +907,7 @@
           <w:sz w:val="20"/>
           <w:szCs w:val="20"/>
         </w:rPr>
-        <w:t xml:space="preserve">New applications appear in the applications review view, which shows all contacts with Mentor Status = Submitted or In Review, with filters to narrow by status.</w:t>
+        <w:t xml:space="preserve">The Mentor Administrator uses the “New Mentors” list view, which shows all contacts with Mentor Status = Submitted or In Review, with filters to narrow by status.</w:t>
       </w:r>
     </w:p>
     <w:p>
@@ -1519,7 +1543,7 @@
                 <w:sz w:val="20"/>
                 <w:szCs w:val="20"/>
               </w:rPr>
-              <w:t xml:space="preserve">The system must provide a single view of applications in Submitted and In Review status, accessible to the Mentor Administrator, with filters to narrow by status.</w:t>
+              <w:t xml:space="preserve">The system must provide a “New Mentors” list view showing contacts with Mentor Status = Submitted or In Review, accessible to the Mentor Administrator, with filters to narrow by status.</w:t>
             </w:r>
           </w:p>
         </w:tc>
@@ -1687,7 +1711,7 @@
                 <w:sz w:val="20"/>
                 <w:szCs w:val="20"/>
               </w:rPr>
-              <w:t xml:space="preserve">The system must perform duplicate detection at application submission by checking for an existing Contact record with a matching email address. Three outcomes: (a) no match — create new record, (b) match found with Mentor Status = Prospect — update existing record, (c) match found with any other status — reject the submission, display an error to the submitter, and send a conflict notification email to the Mentor Administrator.</w:t>
+              <w:t xml:space="preserve">The website form submission must trigger a query to the CRM, searching for an existing Contact record where the email address matches the submitted personal email. If the CRM is unreachable, the form must send an email containing the submission data to the Mentor Administrator for manual processing. Four outcomes when the CRM is available: (a) no match — create new record, (b) match found with Mentor Status = Prospect — update existing record, (c) match found with any other status — reject the submission, display an error to the submitter, and send a conflict notification email to the Mentor Administrator, (d) match exists but is not detected because the applicant used a different email — create new record per outcome (a); the Mentor Administrator uses the contact merge function to consolidate records when the duplicate is identified during review.</w:t>
             </w:r>
           </w:p>
         </w:tc>

</xml_diff>